<commit_message>
Publish English templates with PDF preview gallery
</commit_message>
<xml_diff>
--- a/skills/write-career-documents/assets/generic-cover-letter-template.docx
+++ b/skills/write-career-documents/assets/generic-cover-letter-template.docx
@@ -11,17 +11,15 @@
           <w:szCs w:val="22"/>
         </w:rPr>
       </w:pPr>
-      <w:proofErr w:type="spellStart"/>
-      <w:proofErr w:type="spellEnd"/>
-      <w:r>
-        <w:rPr>
-          <w:rFonts w:ascii="Times New Roman" w:hAnsi="Times New Roman" w:eastAsia="Times New Roman"/>
-          <w:b w:val="0"/>
-          <w:i w:val="0"/>
-          <w:sz w:val="22"/>
-          <w:lang w:val="de-DE"/>
-        </w:rPr>
-        <w:t>Lea Hoffmann | Musterstraße 12 | 50667 Köln</w:t>
+      <w:r>
+        <w:rPr>
+          <w:rFonts w:ascii="Times New Roman" w:hAnsi="Times New Roman" w:eastAsia="Times New Roman"/>
+          <w:b w:val="0"/>
+          <w:i w:val="0"/>
+          <w:sz w:val="22"/>
+          <w:lang w:val="en-GB"/>
+        </w:rPr>
+        <w:t xml:space="preserve">Lea Hoffmann | Musterstraße 12 | 50667 Cologne</w:t>
       </w:r>
     </w:p>
     <w:p>
@@ -39,9 +37,9 @@
           <w:b w:val="0"/>
           <w:i w:val="0"/>
           <w:sz w:val="22"/>
-          <w:lang w:val="de-DE"/>
-        </w:rPr>
-        <w:t>+49 000 0000000 | lea.hoffmann@example.com</w:t>
+          <w:lang w:val="en-GB"/>
+        </w:rPr>
+        <w:t xml:space="preserve">+49 000 0000000 | lea.hoffmann@example.com</w:t>
       </w:r>
     </w:p>
     <w:p>
@@ -58,9 +56,9 @@
           <w:b w:val="0"/>
           <w:i w:val="0"/>
           <w:sz w:val="22"/>
-          <w:lang w:val="de-DE"/>
-        </w:rPr>
-        <w:t>Nordstern Strategy Partners GmbH</w:t>
+          <w:lang w:val="en-GB"/>
+        </w:rPr>
+        <w:t xml:space="preserve">Nordstern Strategy Partners GmbH</w:t>
       </w:r>
     </w:p>
     <w:p>
@@ -77,9 +75,9 @@
           <w:b w:val="0"/>
           <w:i w:val="0"/>
           <w:sz w:val="22"/>
-          <w:lang w:val="de-DE"/>
-        </w:rPr>
-        <w:t>Frau Anna Schneider</w:t>
+          <w:lang w:val="en-GB"/>
+        </w:rPr>
+        <w:t xml:space="preserve">Ms Anna Schneider</w:t>
       </w:r>
     </w:p>
     <w:p>
@@ -96,9 +94,9 @@
           <w:b w:val="0"/>
           <w:i w:val="0"/>
           <w:sz w:val="22"/>
-          <w:lang w:val="de-DE"/>
-        </w:rPr>
-        <w:t>Strategieallee 12</w:t>
+          <w:lang w:val="en-GB"/>
+        </w:rPr>
+        <w:t xml:space="preserve">Strategieallee 12</w:t>
       </w:r>
     </w:p>
     <w:p>
@@ -115,9 +113,9 @@
           <w:b w:val="0"/>
           <w:i w:val="0"/>
           <w:sz w:val="22"/>
-          <w:lang w:val="de-DE"/>
-        </w:rPr>
-        <w:t>60313 Frankfurt am Main</w:t>
+          <w:lang w:val="en-GB"/>
+        </w:rPr>
+        <w:t xml:space="preserve">60313 Frankfurt am Main</w:t>
       </w:r>
     </w:p>
     <w:p>
@@ -134,9 +132,9 @@
           <w:b w:val="0"/>
           <w:i w:val="0"/>
           <w:sz w:val="22"/>
-          <w:lang w:val="de-DE"/>
-        </w:rPr>
-        <w:t>Köln, 20.08.2026</w:t>
+          <w:lang w:val="en-GB"/>
+        </w:rPr>
+        <w:t xml:space="preserve">Cologne, 20 August 2026</w:t>
       </w:r>
     </w:p>
     <w:p>
@@ -158,17 +156,15 @@
           <w:bCs/>
         </w:rPr>
       </w:pPr>
-      <w:proofErr w:type="spellStart"/>
-      <w:proofErr w:type="spellEnd"/>
       <w:r>
         <w:rPr>
           <w:rFonts w:ascii="Times New Roman" w:hAnsi="Times New Roman" w:eastAsia="Times New Roman"/>
           <w:b/>
           <w:i w:val="0"/>
           <w:sz w:val="22"/>
-          <w:lang w:val="de-DE"/>
-        </w:rPr>
-        <w:t>Bewerbung als Junior Consultant Strategy &amp; Transformation</w:t>
+          <w:lang w:val="en-GB"/>
+        </w:rPr>
+        <w:t xml:space="preserve">Application for Junior Consultant Strategy &amp; Transformation</w:t>
       </w:r>
     </w:p>
     <w:p>
@@ -194,9 +190,9 @@
           <w:b w:val="0"/>
           <w:i w:val="0"/>
           <w:sz w:val="22"/>
-          <w:lang w:val="de-DE"/>
-        </w:rPr>
-        <w:t>Sehr geehrte Frau Schneider,</w:t>
+          <w:lang w:val="en-GB"/>
+        </w:rPr>
+        <w:t xml:space="preserve">Dear Ms Schneider,</w:t>
       </w:r>
     </w:p>
     <w:p>
@@ -216,17 +212,15 @@
           <w:rFonts w:ascii="Times New Roman" w:eastAsia="Times New Roman" w:hAnsi="Times New Roman" w:cs="Times New Roman"/>
         </w:rPr>
       </w:pPr>
-      <w:proofErr w:type="spellStart"/>
-      <w:proofErr w:type="spellEnd"/>
-      <w:r>
-        <w:rPr>
-          <w:rFonts w:ascii="Times New Roman" w:hAnsi="Times New Roman" w:eastAsia="Times New Roman"/>
-          <w:b w:val="0"/>
-          <w:i w:val="0"/>
-          <w:sz w:val="22"/>
-          <w:lang w:val="de-DE"/>
-        </w:rPr>
-        <w:t>die Position als Junior Consultant interessiert mich, weil Nordstern Strategieentwicklung mit der anschließenden Umsetzung in mittelständischen Unternehmen verbindet. Besonders relevant ist für mich die Möglichkeit, analytisch an Wachstums- und Transformationsfragen zu arbeiten und zugleich Verantwortung für klar abgegrenzte Projektmodule zu übernehmen. Der in Ihrer Ausschreibung beschriebene Fokus auf belastbare Analysen, gemeinsame Lösungsentwicklung mit Kunden und sichtbare Umsetzung entspricht deshalb genau der Arbeitsweise, die ich weiter vertiefen möchte.</w:t>
+      <w:r>
+        <w:rPr>
+          <w:rFonts w:ascii="Times New Roman" w:hAnsi="Times New Roman" w:eastAsia="Times New Roman"/>
+          <w:b w:val="0"/>
+          <w:i w:val="0"/>
+          <w:sz w:val="22"/>
+          <w:lang w:val="en-GB"/>
+        </w:rPr>
+        <w:t xml:space="preserve">I am applying for the Junior Consultant position because Nordstern combines strategy development with implementation for mid-sized businesses. The role's emphasis on growth and transformation would allow me to contribute my experience in market analysis and business cases while supporting defined project workstreams. Your advertised focus on evidence-based analysis and working with clients through implementation closely matches the work I have undertaken in corporate strategy and a founder's office.</w:t>
       </w:r>
     </w:p>
     <w:p>
@@ -246,17 +240,15 @@
           <w:rFonts w:ascii="Times New Roman" w:eastAsia="Times New Roman" w:hAnsi="Times New Roman" w:cs="Times New Roman"/>
         </w:rPr>
       </w:pPr>
-      <w:proofErr w:type="spellStart"/>
-      <w:proofErr w:type="spellEnd"/>
-      <w:r>
-        <w:rPr>
-          <w:rFonts w:ascii="Times New Roman" w:hAnsi="Times New Roman" w:eastAsia="Times New Roman"/>
-          <w:b w:val="0"/>
-          <w:i w:val="0"/>
-          <w:sz w:val="22"/>
-          <w:lang w:val="de-DE"/>
-        </w:rPr>
-        <w:t>Während meines Praktikums im Corporate-Strategy-Team der Rheintec Industries AG analysierte ich fünf europäische Wachstumsmärkte für eine neue Serviceplattform. Dafür strukturierte ich Markt-, Wettbewerbs- und Kundendaten und entwickelte gemeinsam mit Finance einen Business Case für drei Markteintrittsszenarien. Die Ergebnisse flossen in einen Strategieworkshop mit der Geschäftsleitung ein. Dabei habe ich gelernt, Analysen nicht nur methodisch sauber aufzubauen, sondern konsequent auf die anstehende Entscheidung auszurichten.</w:t>
+      <w:r>
+        <w:rPr>
+          <w:rFonts w:ascii="Times New Roman" w:hAnsi="Times New Roman" w:eastAsia="Times New Roman"/>
+          <w:b w:val="0"/>
+          <w:i w:val="0"/>
+          <w:sz w:val="22"/>
+          <w:lang w:val="en-GB"/>
+        </w:rPr>
+        <w:t xml:space="preserve">During my corporate strategy internship at Rheintec Industries AG, I analysed five European growth markets for a new service platform. I structured market, competitor and customer data and developed a business case with Finance covering three market-entry scenarios. The findings informed a strategy workshop with senior management. This work required connecting the underlying analysis to the alternatives facing the management team.</w:t>
       </w:r>
     </w:p>
     <w:p>
@@ -276,21 +268,15 @@
           <w:rFonts w:ascii="Times New Roman" w:eastAsia="Times New Roman" w:hAnsi="Times New Roman" w:cs="Times New Roman"/>
         </w:rPr>
       </w:pPr>
-      <w:proofErr w:type="spellStart"/>
-      <w:proofErr w:type="spellEnd"/>
-      <w:proofErr w:type="spellStart"/>
-      <w:proofErr w:type="spellEnd"/>
-      <w:proofErr w:type="spellStart"/>
-      <w:proofErr w:type="spellEnd"/>
-      <w:r>
-        <w:rPr>
-          <w:rFonts w:ascii="Times New Roman" w:hAnsi="Times New Roman" w:eastAsia="Times New Roman"/>
-          <w:b w:val="0"/>
-          <w:i w:val="0"/>
-          <w:sz w:val="22"/>
-          <w:lang w:val="de-DE"/>
-        </w:rPr>
-        <w:t>Ergänzend konnte ich bei Lumen Mobility operative Umsetzungserfahrung sammeln. Im Founder’s Office analysierte ich den Kunden-Onboarding-Prozess und unterstützte einen Test, der die durchschnittliche Bearbeitungszeit um 18 Prozent reduzierte. Zuvor bereitete ich bei einer Beteiligungsberatung finanzielle Analysen zu Umsatzqualität, Kundenkonzentration und Working Capital auf. Diese Kombination aus strategischer Strukturierung, finanzieller Analyse und praktischer Verbesserung möchte ich in die Projektarbeit bei Nordstern einbringen.</w:t>
+      <w:r>
+        <w:rPr>
+          <w:rFonts w:ascii="Times New Roman" w:hAnsi="Times New Roman" w:eastAsia="Times New Roman"/>
+          <w:b w:val="0"/>
+          <w:i w:val="0"/>
+          <w:sz w:val="22"/>
+          <w:lang w:val="en-GB"/>
+        </w:rPr>
+        <w:t xml:space="preserve">At Lumen Mobility, I analysed the customer onboarding process and supported a trial that reduced average processing time by 18 percent. In an earlier transaction services internship, I prepared financial analyses of revenue quality, customer concentration and working capital. I would bring this combination of strategic analysis, financial assessment and operational experience to Nordstern's client projects.</w:t>
       </w:r>
     </w:p>
     <w:p>
@@ -310,21 +296,15 @@
           <w:rFonts w:ascii="Times New Roman" w:eastAsia="Times New Roman" w:hAnsi="Times New Roman" w:cs="Times New Roman"/>
         </w:rPr>
       </w:pPr>
-      <w:proofErr w:type="spellStart"/>
-      <w:proofErr w:type="spellEnd"/>
-      <w:proofErr w:type="spellStart"/>
-      <w:proofErr w:type="spellEnd"/>
-      <w:proofErr w:type="spellStart"/>
-      <w:proofErr w:type="spellEnd"/>
-      <w:r>
-        <w:rPr>
-          <w:rFonts w:ascii="Times New Roman" w:hAnsi="Times New Roman" w:eastAsia="Times New Roman"/>
-          <w:b w:val="0"/>
-          <w:i w:val="0"/>
-          <w:sz w:val="22"/>
-          <w:lang w:val="de-DE"/>
-        </w:rPr>
-        <w:t>Als Projektleiterin einer studentischen Unternehmensberatung koordinierte ich außerdem ein vierköpfiges Team bei der Entwicklung einer Markteintrittsstrategie für einen B2B-Softwareanbieter. Ich verantwortete die Zusammenführung von Kundeninterviews, Wettbewerbsanalyse und Handlungsempfehlungen über eine Projektlaufzeit von zehn Wochen. Auch unter engem Zeitrahmen arbeite ich strukturiert, kommuniziere Zwischenergebnisse offen und halte die Argumentation auf die Entscheidung des Kunden ausgerichtet.</w:t>
+      <w:r>
+        <w:rPr>
+          <w:rFonts w:ascii="Times New Roman" w:hAnsi="Times New Roman" w:eastAsia="Times New Roman"/>
+          <w:b w:val="0"/>
+          <w:i w:val="0"/>
+          <w:sz w:val="22"/>
+          <w:lang w:val="en-GB"/>
+        </w:rPr>
+        <w:t xml:space="preserve">As a project lead in a student consulting association, I also coordinated a four-person team developing a market-entry strategy for a B2B software provider. Over ten weeks, I brought together customer interviews, competitor analysis and recommendations for the final presentation. This experience is relevant to organising a defined workstream and turning several sources of evidence into a clear client recommendation.</w:t>
       </w:r>
     </w:p>
     <w:p>
@@ -350,9 +330,9 @@
           <w:b w:val="0"/>
           <w:i w:val="0"/>
           <w:sz w:val="22"/>
-          <w:lang w:val="de-DE"/>
-        </w:rPr>
-        <w:t>Gerne erläutere ich Ihnen in einem persönlichen Gespräch, wie ich meine Erfahrungen in Marktanalyse, Business Cases und operativer Verbesserung bei Nordstern einbringen kann. Ich freue mich auf Ihre Rückmeldung.</w:t>
+          <w:lang w:val="en-GB"/>
+        </w:rPr>
+        <w:t xml:space="preserve">I would welcome the opportunity to discuss how my experience in market analysis, business cases and operational improvement could contribute to Nordstern's projects. Thank you for considering my application.</w:t>
       </w:r>
     </w:p>
     <w:p>
@@ -378,9 +358,9 @@
           <w:b w:val="0"/>
           <w:i w:val="0"/>
           <w:sz w:val="22"/>
-          <w:lang w:val="de-DE"/>
-        </w:rPr>
-        <w:t>Mit freundlichen Grüßen</w:t>
+          <w:lang w:val="en-GB"/>
+        </w:rPr>
+        <w:t xml:space="preserve">Yours sincerely,</w:t>
       </w:r>
     </w:p>
     <w:p>
@@ -425,9 +405,9 @@
           <w:b w:val="0"/>
           <w:i w:val="0"/>
           <w:sz w:val="22"/>
-          <w:lang w:val="de-DE"/>
-        </w:rPr>
-        <w:t>Lea Hoffmann</w:t>
+          <w:lang w:val="en-GB"/>
+        </w:rPr>
+        <w:t xml:space="preserve">Lea Hoffmann</w:t>
       </w:r>
     </w:p>
     <w:sectPr>
@@ -448,7 +428,7 @@
         <w:rFonts w:asciiTheme="minorHAnsi" w:eastAsiaTheme="minorHAnsi" w:hAnsiTheme="minorHAnsi" w:cstheme="minorBidi"/>
         <w:sz w:val="22"/>
         <w:szCs w:val="22"/>
-        <w:lang w:val="de-DE" w:eastAsia="en-US" w:bidi="ar-SA"/>
+        <w:lang w:val="en-GB" w:eastAsia="en-US" w:bidi="ar-SA"/>
       </w:rPr>
     </w:rPrDefault>
     <w:pPrDefault>
@@ -1028,7 +1008,7 @@
       <w:color w:val="000000"/>
       <w:sz w:val="17"/>
       <w:szCs w:val="17"/>
-      <w:lang w:eastAsia="de-DE"/>
+      <w:lang w:eastAsia="en-GB"/>
     </w:rPr>
   </w:style>
 </w:styles>

</xml_diff>

<commit_message>
Refresh repository identity and refine writing calibration
</commit_message>
<xml_diff>
--- a/skills/write-career-documents/assets/generic-cover-letter-template.docx
+++ b/skills/write-career-documents/assets/generic-cover-letter-template.docx
@@ -220,7 +220,7 @@
           <w:sz w:val="22"/>
           <w:lang w:val="en-GB"/>
         </w:rPr>
-        <w:t xml:space="preserve">I am applying for the Junior Consultant position because Nordstern combines strategy development with implementation for mid-sized businesses. The role's emphasis on growth and transformation would allow me to contribute my experience in market analysis and business cases while supporting defined project workstreams. Your advertised focus on evidence-based analysis and working with clients through implementation closely matches the work I have undertaken in corporate strategy and a founder's office.</w:t>
+        <w:t>The Junior Consultant role at Nordstern brings together strategy development and implementation for mid-sized businesses. I am applying because that combination matches the work I have undertaken in corporate strategy and a founder's office.</w:t>
       </w:r>
     </w:p>
     <w:p>
@@ -248,7 +248,7 @@
           <w:sz w:val="22"/>
           <w:lang w:val="en-GB"/>
         </w:rPr>
-        <w:t xml:space="preserve">During my corporate strategy internship at Rheintec Industries AG, I analysed five European growth markets for a new service platform. I structured market, competitor and customer data and developed a business case with Finance covering three market-entry scenarios. The findings informed a strategy workshop with senior management. This work required connecting the underlying analysis to the alternatives facing the management team.</w:t>
+        <w:t>At Rheintec Industries AG, I analysed five European growth markets for a new service platform and developed a business case with Finance covering three market-entry scenarios. The findings informed a strategy workshop with senior management. My earlier transaction services work covered revenue quality, customer concentration and working capital, providing relevant financial analysis experience for comparing strategic options.</w:t>
       </w:r>
     </w:p>
     <w:p>
@@ -276,7 +276,7 @@
           <w:sz w:val="22"/>
           <w:lang w:val="en-GB"/>
         </w:rPr>
-        <w:t xml:space="preserve">At Lumen Mobility, I analysed the customer onboarding process and supported a trial that reduced average processing time by 18 percent. In an earlier transaction services internship, I prepared financial analyses of revenue quality, customer concentration and working capital. I would bring this combination of strategic analysis, financial assessment and operational experience to Nordstern's client projects.</w:t>
+        <w:t>On the implementation side, I analysed the customer onboarding process at Lumen Mobility and supported a trial that reduced average processing time by 18 percent. I also coordinated a four-person student consulting team developing a market-entry strategy for a B2B software provider. Over ten weeks, I brought together customer interviews, competitor analysis and recommendations for the final presentation. I would draw on this experience to support defined workstreams from analysis through delivery.</w:t>
       </w:r>
     </w:p>
     <w:p>
@@ -304,35 +304,7 @@
           <w:sz w:val="22"/>
           <w:lang w:val="en-GB"/>
         </w:rPr>
-        <w:t xml:space="preserve">As a project lead in a student consulting association, I also coordinated a four-person team developing a market-entry strategy for a B2B software provider. Over ten weeks, I brought together customer interviews, competitor analysis and recommendations for the final presentation. This experience is relevant to organising a defined workstream and turning several sources of evidence into a clear client recommendation.</w:t>
-      </w:r>
-    </w:p>
-    <w:p>
-      <w:pPr>
-        <w:spacing w:after="0"/>
-        <w:jc w:val="both"/>
-        <w:rPr>
-          <w:rFonts w:ascii="Times New Roman" w:eastAsia="Times New Roman" w:hAnsi="Times New Roman" w:cs="Times New Roman"/>
-        </w:rPr>
-      </w:pPr>
-    </w:p>
-    <w:p>
-      <w:pPr>
-        <w:spacing w:after="0"/>
-        <w:jc w:val="left"/>
-        <w:rPr>
-          <w:rFonts w:ascii="Times New Roman" w:eastAsia="Times New Roman" w:hAnsi="Times New Roman" w:cs="Times New Roman"/>
-        </w:rPr>
-      </w:pPr>
-      <w:r>
-        <w:rPr>
-          <w:rFonts w:ascii="Times New Roman" w:hAnsi="Times New Roman" w:eastAsia="Times New Roman"/>
-          <w:b w:val="0"/>
-          <w:i w:val="0"/>
-          <w:sz w:val="22"/>
-          <w:lang w:val="en-GB"/>
-        </w:rPr>
-        <w:t xml:space="preserve">I would welcome the opportunity to discuss how my experience in market analysis, business cases and operational improvement could contribute to Nordstern's projects. Thank you for considering my application.</w:t>
+        <w:t>I would welcome the opportunity to discuss how I could contribute to Nordstern's strategy and transformation projects.</w:t>
       </w:r>
     </w:p>
     <w:p>

</xml_diff>

<commit_message>
Fit career templates to content within readable layout limits
</commit_message>
<xml_diff>
--- a/skills/write-career-documents/assets/generic-cover-letter-template.docx
+++ b/skills/write-career-documents/assets/generic-cover-letter-template.docx
@@ -5,6 +5,7 @@
     <w:p>
       <w:pPr>
         <w:pStyle w:val="p1"/>
+        <w:spacing w:line="320" w:lineRule="atLeast" w:before="0" w:after="0"/>
         <w:jc w:val="right"/>
         <w:rPr>
           <w:sz w:val="22"/>
@@ -16,7 +17,7 @@
           <w:rFonts w:ascii="Times New Roman" w:hAnsi="Times New Roman" w:eastAsia="Times New Roman"/>
           <w:b w:val="0"/>
           <w:i w:val="0"/>
-          <w:sz w:val="22"/>
+          <w:sz w:val="24"/>
           <w:lang w:val="en-GB"/>
         </w:rPr>
         <w:t xml:space="preserve">Lea Hoffmann | Musterstraße 12 | 50667 Cologne</w:t>
@@ -25,6 +26,7 @@
     <w:p>
       <w:pPr>
         <w:pStyle w:val="p1"/>
+        <w:spacing w:line="320" w:lineRule="atLeast" w:before="0" w:after="240"/>
         <w:jc w:val="right"/>
         <w:rPr>
           <w:sz w:val="22"/>
@@ -36,7 +38,7 @@
           <w:rFonts w:ascii="Times New Roman" w:hAnsi="Times New Roman" w:eastAsia="Times New Roman"/>
           <w:b w:val="0"/>
           <w:i w:val="0"/>
-          <w:sz w:val="22"/>
+          <w:sz w:val="24"/>
           <w:lang w:val="en-GB"/>
         </w:rPr>
         <w:t xml:space="preserve">+49 000 0000000 | lea.hoffmann@example.com</w:t>
@@ -44,7 +46,7 @@
     </w:p>
     <w:p>
       <w:pPr>
-        <w:spacing w:after="0"/>
+        <w:spacing w:after="0" w:line="320" w:lineRule="atLeast" w:before="0"/>
         <w:rPr>
           <w:rFonts w:ascii="Times New Roman" w:eastAsia="Times New Roman" w:hAnsi="Times New Roman" w:cs="Times New Roman"/>
           <w:color w:val="000000" w:themeColor="text1"/>
@@ -55,7 +57,7 @@
           <w:rFonts w:ascii="Times New Roman" w:hAnsi="Times New Roman" w:eastAsia="Times New Roman"/>
           <w:b w:val="0"/>
           <w:i w:val="0"/>
-          <w:sz w:val="22"/>
+          <w:sz w:val="24"/>
           <w:lang w:val="en-GB"/>
         </w:rPr>
         <w:t xml:space="preserve">Nordstern Strategy Partners GmbH</w:t>
@@ -63,7 +65,7 @@
     </w:p>
     <w:p>
       <w:pPr>
-        <w:spacing w:after="0"/>
+        <w:spacing w:after="0" w:line="320" w:lineRule="atLeast" w:before="0"/>
         <w:rPr>
           <w:rFonts w:ascii="Times New Roman" w:eastAsia="Times New Roman" w:hAnsi="Times New Roman" w:cs="Times New Roman"/>
           <w:color w:val="000000" w:themeColor="text1"/>
@@ -74,7 +76,7 @@
           <w:rFonts w:ascii="Times New Roman" w:hAnsi="Times New Roman" w:eastAsia="Times New Roman"/>
           <w:b w:val="0"/>
           <w:i w:val="0"/>
-          <w:sz w:val="22"/>
+          <w:sz w:val="24"/>
           <w:lang w:val="en-GB"/>
         </w:rPr>
         <w:t xml:space="preserve">Ms Anna Schneider</w:t>
@@ -82,7 +84,7 @@
     </w:p>
     <w:p>
       <w:pPr>
-        <w:spacing w:after="0"/>
+        <w:spacing w:after="0" w:line="320" w:lineRule="atLeast" w:before="0"/>
         <w:rPr>
           <w:rFonts w:ascii="Times New Roman" w:eastAsia="Times New Roman" w:hAnsi="Times New Roman" w:cs="Times New Roman"/>
           <w:color w:val="000000" w:themeColor="text1"/>
@@ -93,7 +95,7 @@
           <w:rFonts w:ascii="Times New Roman" w:hAnsi="Times New Roman" w:eastAsia="Times New Roman"/>
           <w:b w:val="0"/>
           <w:i w:val="0"/>
-          <w:sz w:val="22"/>
+          <w:sz w:val="24"/>
           <w:lang w:val="en-GB"/>
         </w:rPr>
         <w:t xml:space="preserve">Strategieallee 12</w:t>
@@ -101,7 +103,7 @@
     </w:p>
     <w:p>
       <w:pPr>
-        <w:spacing w:after="0"/>
+        <w:spacing w:after="0" w:line="320" w:lineRule="atLeast" w:before="0"/>
         <w:rPr>
           <w:rFonts w:ascii="Times New Roman" w:eastAsia="Times New Roman" w:hAnsi="Times New Roman" w:cs="Times New Roman"/>
           <w:color w:val="000000" w:themeColor="text1"/>
@@ -112,7 +114,7 @@
           <w:rFonts w:ascii="Times New Roman" w:hAnsi="Times New Roman" w:eastAsia="Times New Roman"/>
           <w:b w:val="0"/>
           <w:i w:val="0"/>
-          <w:sz w:val="22"/>
+          <w:sz w:val="24"/>
           <w:lang w:val="en-GB"/>
         </w:rPr>
         <w:t xml:space="preserve">60313 Frankfurt am Main</w:t>
@@ -120,7 +122,7 @@
     </w:p>
     <w:p>
       <w:pPr>
-        <w:spacing w:after="0"/>
+        <w:spacing w:after="400" w:line="320" w:lineRule="atLeast" w:before="240"/>
         <w:jc w:val="right"/>
         <w:rPr>
           <w:rFonts w:ascii="Times New Roman" w:eastAsia="Times New Roman" w:hAnsi="Times New Roman" w:cs="Times New Roman"/>
@@ -131,7 +133,7 @@
           <w:rFonts w:ascii="Times New Roman" w:hAnsi="Times New Roman" w:eastAsia="Times New Roman"/>
           <w:b w:val="0"/>
           <w:i w:val="0"/>
-          <w:sz w:val="22"/>
+          <w:sz w:val="24"/>
           <w:lang w:val="en-GB"/>
         </w:rPr>
         <w:t xml:space="preserve">Cologne, 20 August 2026</w:t>
@@ -139,16 +141,7 @@
     </w:p>
     <w:p>
       <w:pPr>
-        <w:spacing w:after="0"/>
-        <w:jc w:val="right"/>
-        <w:rPr>
-          <w:rFonts w:ascii="Times New Roman" w:eastAsia="Times New Roman" w:hAnsi="Times New Roman" w:cs="Times New Roman"/>
-        </w:rPr>
-      </w:pPr>
-    </w:p>
-    <w:p>
-      <w:pPr>
-        <w:spacing w:after="0"/>
+        <w:spacing w:after="400" w:line="320" w:lineRule="atLeast" w:before="0"/>
         <w:jc w:val="left"/>
         <w:rPr>
           <w:rFonts w:ascii="Times New Roman" w:eastAsia="Times New Roman" w:hAnsi="Times New Roman" w:cs="Times New Roman"/>
@@ -161,7 +154,7 @@
           <w:rFonts w:ascii="Times New Roman" w:hAnsi="Times New Roman" w:eastAsia="Times New Roman"/>
           <w:b/>
           <w:i w:val="0"/>
-          <w:sz w:val="22"/>
+          <w:sz w:val="24"/>
           <w:lang w:val="en-GB"/>
         </w:rPr>
         <w:t xml:space="preserve">Application for Junior Consultant Strategy &amp; Transformation</w:t>
@@ -169,16 +162,7 @@
     </w:p>
     <w:p>
       <w:pPr>
-        <w:spacing w:after="0"/>
-        <w:jc w:val="both"/>
-        <w:rPr>
-          <w:rFonts w:ascii="Times New Roman" w:eastAsia="Times New Roman" w:hAnsi="Times New Roman" w:cs="Times New Roman"/>
-        </w:rPr>
-      </w:pPr>
-    </w:p>
-    <w:p>
-      <w:pPr>
-        <w:spacing w:after="0"/>
+        <w:spacing w:after="360" w:line="360" w:lineRule="atLeast" w:before="0"/>
         <w:jc w:val="left"/>
         <w:rPr>
           <w:rFonts w:ascii="Times New Roman" w:eastAsia="Times New Roman" w:hAnsi="Times New Roman" w:cs="Times New Roman"/>
@@ -189,7 +173,7 @@
           <w:rFonts w:ascii="Times New Roman" w:hAnsi="Times New Roman" w:eastAsia="Times New Roman"/>
           <w:b w:val="0"/>
           <w:i w:val="0"/>
-          <w:sz w:val="22"/>
+          <w:sz w:val="24"/>
           <w:lang w:val="en-GB"/>
         </w:rPr>
         <w:t xml:space="preserve">Dear Ms Schneider,</w:t>
@@ -197,16 +181,7 @@
     </w:p>
     <w:p>
       <w:pPr>
-        <w:spacing w:after="0"/>
-        <w:jc w:val="both"/>
-        <w:rPr>
-          <w:rFonts w:ascii="Times New Roman" w:eastAsia="Times New Roman" w:hAnsi="Times New Roman" w:cs="Times New Roman"/>
-        </w:rPr>
-      </w:pPr>
-    </w:p>
-    <w:p>
-      <w:pPr>
-        <w:spacing w:after="0"/>
+        <w:spacing w:after="360" w:line="360" w:lineRule="atLeast" w:before="0"/>
         <w:jc w:val="left"/>
         <w:rPr>
           <w:rFonts w:ascii="Times New Roman" w:eastAsia="Times New Roman" w:hAnsi="Times New Roman" w:cs="Times New Roman"/>
@@ -217,7 +192,7 @@
           <w:rFonts w:ascii="Times New Roman" w:hAnsi="Times New Roman" w:eastAsia="Times New Roman"/>
           <w:b w:val="0"/>
           <w:i w:val="0"/>
-          <w:sz w:val="22"/>
+          <w:sz w:val="24"/>
           <w:lang w:val="en-GB"/>
         </w:rPr>
         <w:t>The Junior Consultant role at Nordstern brings together strategy development and implementation for mid-sized businesses. I am applying because that combination matches the work I have undertaken in corporate strategy and a founder's office.</w:t>
@@ -225,16 +200,7 @@
     </w:p>
     <w:p>
       <w:pPr>
-        <w:spacing w:after="0"/>
-        <w:jc w:val="both"/>
-        <w:rPr>
-          <w:rFonts w:ascii="Times New Roman" w:eastAsia="Times New Roman" w:hAnsi="Times New Roman" w:cs="Times New Roman"/>
-        </w:rPr>
-      </w:pPr>
-    </w:p>
-    <w:p>
-      <w:pPr>
-        <w:spacing w:after="0"/>
+        <w:spacing w:after="360" w:line="360" w:lineRule="atLeast" w:before="0"/>
         <w:jc w:val="left"/>
         <w:rPr>
           <w:rFonts w:ascii="Times New Roman" w:eastAsia="Times New Roman" w:hAnsi="Times New Roman" w:cs="Times New Roman"/>
@@ -245,7 +211,7 @@
           <w:rFonts w:ascii="Times New Roman" w:hAnsi="Times New Roman" w:eastAsia="Times New Roman"/>
           <w:b w:val="0"/>
           <w:i w:val="0"/>
-          <w:sz w:val="22"/>
+          <w:sz w:val="24"/>
           <w:lang w:val="en-GB"/>
         </w:rPr>
         <w:t>At Rheintec Industries AG, I analysed five European growth markets for a new service platform and developed a business case with Finance covering three market-entry scenarios. The findings informed a strategy workshop with senior management. My earlier transaction services work covered revenue quality, customer concentration and working capital, providing relevant financial analysis experience for comparing strategic options.</w:t>
@@ -253,16 +219,7 @@
     </w:p>
     <w:p>
       <w:pPr>
-        <w:spacing w:after="0"/>
-        <w:jc w:val="both"/>
-        <w:rPr>
-          <w:rFonts w:ascii="Times New Roman" w:eastAsia="Times New Roman" w:hAnsi="Times New Roman" w:cs="Times New Roman"/>
-        </w:rPr>
-      </w:pPr>
-    </w:p>
-    <w:p>
-      <w:pPr>
-        <w:spacing w:after="0"/>
+        <w:spacing w:after="360" w:line="360" w:lineRule="atLeast" w:before="0"/>
         <w:jc w:val="left"/>
         <w:rPr>
           <w:rFonts w:ascii="Times New Roman" w:eastAsia="Times New Roman" w:hAnsi="Times New Roman" w:cs="Times New Roman"/>
@@ -273,7 +230,7 @@
           <w:rFonts w:ascii="Times New Roman" w:hAnsi="Times New Roman" w:eastAsia="Times New Roman"/>
           <w:b w:val="0"/>
           <w:i w:val="0"/>
-          <w:sz w:val="22"/>
+          <w:sz w:val="24"/>
           <w:lang w:val="en-GB"/>
         </w:rPr>
         <w:t>On the implementation side, I analysed the customer onboarding process at Lumen Mobility and supported a trial that reduced average processing time by 18 percent. I also coordinated a four-person student consulting team developing a market-entry strategy for a B2B software provider. Over ten weeks, I brought together customer interviews, competitor analysis and recommendations for the final presentation. I would draw on this experience to support defined workstreams from analysis through delivery.</w:t>
@@ -281,16 +238,7 @@
     </w:p>
     <w:p>
       <w:pPr>
-        <w:spacing w:after="0"/>
-        <w:jc w:val="both"/>
-        <w:rPr>
-          <w:rFonts w:ascii="Times New Roman" w:eastAsia="Times New Roman" w:hAnsi="Times New Roman" w:cs="Times New Roman"/>
-        </w:rPr>
-      </w:pPr>
-    </w:p>
-    <w:p>
-      <w:pPr>
-        <w:spacing w:after="0"/>
+        <w:spacing w:after="360" w:line="360" w:lineRule="atLeast" w:before="0"/>
         <w:jc w:val="left"/>
         <w:rPr>
           <w:rFonts w:ascii="Times New Roman" w:eastAsia="Times New Roman" w:hAnsi="Times New Roman" w:cs="Times New Roman"/>
@@ -301,7 +249,7 @@
           <w:rFonts w:ascii="Times New Roman" w:hAnsi="Times New Roman" w:eastAsia="Times New Roman"/>
           <w:b w:val="0"/>
           <w:i w:val="0"/>
-          <w:sz w:val="22"/>
+          <w:sz w:val="24"/>
           <w:lang w:val="en-GB"/>
         </w:rPr>
         <w:t>I would welcome the opportunity to discuss how I could contribute to Nordstern's strategy and transformation projects.</w:t>
@@ -309,16 +257,7 @@
     </w:p>
     <w:p>
       <w:pPr>
-        <w:spacing w:after="0"/>
-        <w:jc w:val="both"/>
-        <w:rPr>
-          <w:rFonts w:ascii="Times New Roman" w:eastAsia="Times New Roman" w:hAnsi="Times New Roman" w:cs="Times New Roman"/>
-        </w:rPr>
-      </w:pPr>
-    </w:p>
-    <w:p>
-      <w:pPr>
-        <w:spacing w:after="0"/>
+        <w:spacing w:after="640" w:line="344" w:lineRule="atLeast" w:before="0"/>
         <w:jc w:val="left"/>
         <w:rPr>
           <w:rFonts w:ascii="Times New Roman" w:eastAsia="Times New Roman" w:hAnsi="Times New Roman" w:cs="Times New Roman"/>
@@ -329,7 +268,7 @@
           <w:rFonts w:ascii="Times New Roman" w:hAnsi="Times New Roman" w:eastAsia="Times New Roman"/>
           <w:b w:val="0"/>
           <w:i w:val="0"/>
-          <w:sz w:val="22"/>
+          <w:sz w:val="24"/>
           <w:lang w:val="en-GB"/>
         </w:rPr>
         <w:t xml:space="preserve">Yours sincerely,</w:t>
@@ -337,34 +276,7 @@
     </w:p>
     <w:p>
       <w:pPr>
-        <w:spacing w:after="0"/>
-        <w:jc w:val="both"/>
-        <w:rPr>
-          <w:rFonts w:ascii="Times New Roman" w:eastAsia="Times New Roman" w:hAnsi="Times New Roman" w:cs="Times New Roman"/>
-        </w:rPr>
-      </w:pPr>
-    </w:p>
-    <w:p>
-      <w:pPr>
-        <w:spacing w:after="0"/>
-        <w:jc w:val="both"/>
-        <w:rPr>
-          <w:rFonts w:ascii="Times New Roman" w:eastAsia="Times New Roman" w:hAnsi="Times New Roman" w:cs="Times New Roman"/>
-        </w:rPr>
-      </w:pPr>
-    </w:p>
-    <w:p>
-      <w:pPr>
-        <w:spacing w:after="0"/>
-        <w:jc w:val="both"/>
-        <w:rPr>
-          <w:rFonts w:ascii="Times New Roman" w:eastAsia="Times New Roman" w:hAnsi="Times New Roman" w:cs="Times New Roman"/>
-        </w:rPr>
-      </w:pPr>
-    </w:p>
-    <w:p>
-      <w:pPr>
-        <w:spacing w:after="0"/>
+        <w:spacing w:after="0" w:line="320" w:lineRule="atLeast" w:before="0"/>
         <w:jc w:val="left"/>
         <w:rPr>
           <w:rFonts w:ascii="Times New Roman" w:eastAsia="Times New Roman" w:hAnsi="Times New Roman" w:cs="Times New Roman"/>
@@ -376,7 +288,7 @@
           <w:rFonts w:ascii="Times New Roman" w:hAnsi="Times New Roman" w:eastAsia="Times New Roman"/>
           <w:b w:val="0"/>
           <w:i w:val="0"/>
-          <w:sz w:val="22"/>
+          <w:sz w:val="24"/>
           <w:lang w:val="en-GB"/>
         </w:rPr>
         <w:t xml:space="preserve">Lea Hoffmann</w:t>
@@ -384,7 +296,7 @@
     </w:p>
     <w:sectPr>
       <w:pgSz w:w="11906" w:h="16838"/>
-      <w:pgMar w:top="1021" w:right="1247" w:bottom="397" w:left="1247" w:header="709" w:footer="709" w:gutter="0"/>
+      <w:pgMar w:top="1020" w:right="1417" w:bottom="1020" w:left="1417" w:header="709" w:footer="709" w:gutter="0"/>
       <w:cols w:space="708"/>
       <w:docGrid w:linePitch="360"/>
     </w:sectPr>
@@ -788,6 +700,9 @@
   <w:style w:type="paragraph" w:default="1" w:styleId="Standard">
     <w:name w:val="Normal"/>
     <w:qFormat/>
+    <w:rPr>
+      <w:sz w:val="24"/>
+    </w:rPr>
   </w:style>
   <w:style w:type="character" w:default="1" w:styleId="Absatz-Standardschriftart">
     <w:name w:val="Default Paragraph Font"/>

</xml_diff>